<commit_message>
docs(demo-script): expand Scenario Analysis section to 2 min
Co-Authored-By: Claude Opus 5.5 <noreply@anthropic.com>
Claude-Session: https://claude.ai/code/session_01JgaDeRwR4Ws5FZizR9gcgf
</commit_message>
<xml_diff>
--- a/docs/Risk_Operating_System_Demo_Script.docx
+++ b/docs/Risk_Operating_System_Demo_Script.docx
@@ -883,7 +883,7 @@
                 <w:sz w:val="20"/>
                 <w:szCs w:val="20"/>
               </w:rPr>
-              <w:t xml:space="preserve">1.5</w:t>
+              <w:t xml:space="preserve">1</w:t>
             </w:r>
           </w:p>
         </w:tc>
@@ -975,7 +975,7 @@
                 <w:sz w:val="20"/>
                 <w:szCs w:val="20"/>
               </w:rPr>
-              <w:t xml:space="preserve">Signal to decision</w:t>
+              <w:t xml:space="preserve">Scenario analysis</w:t>
             </w:r>
           </w:p>
         </w:tc>
@@ -1004,7 +1004,7 @@
                 <w:sz w:val="20"/>
                 <w:szCs w:val="20"/>
               </w:rPr>
-              <w:t xml:space="preserve">1.5</w:t>
+              <w:t xml:space="preserve">2</w:t>
             </w:r>
           </w:p>
         </w:tc>
@@ -1033,7 +1033,7 @@
                 <w:sz w:val="20"/>
                 <w:szCs w:val="20"/>
               </w:rPr>
-              <w:t xml:space="preserve">Stress &amp; decide &gt; Govern</w:t>
+              <w:t xml:space="preserve">5 · Stress &amp; decide (Scenario Analysis page) &gt; Govern</w:t>
             </w:r>
           </w:p>
         </w:tc>
@@ -1629,7 +1629,7 @@
           <w:sz w:val="23"/>
           <w:szCs w:val="23"/>
         </w:rPr>
-        <w:t xml:space="preserve">4. Hero story  (1.5 min)</w:t>
+        <w:t xml:space="preserve">4. Hero story  (1 min)</w:t>
       </w:r>
     </w:p>
     <w:p>
@@ -1751,7 +1751,7 @@
           <w:sz w:val="23"/>
           <w:szCs w:val="23"/>
         </w:rPr>
-        <w:t xml:space="preserve">5. From signal to decision  (1.5 min)</w:t>
+        <w:t xml:space="preserve">5. Scenario analysis: from signal to decision  (2 min)</w:t>
       </w:r>
     </w:p>
     <w:p>
@@ -1776,7 +1776,7 @@
           <w:sz w:val="21"/>
           <w:szCs w:val="21"/>
         </w:rPr>
-        <w:t xml:space="preserve">Sidebar: 5 · Stress &amp; decide</w:t>
+        <w:t xml:space="preserve">Sidebar: 5 · Stress &amp; decide (this is the Scenario Analysis page)</w:t>
       </w:r>
     </w:p>
     <w:p>
@@ -1801,7 +1801,7 @@
           <w:sz w:val="21"/>
           <w:szCs w:val="21"/>
         </w:rPr>
-        <w:t xml:space="preserve">Preset "Construction Cost Shock", then Run scenario. Then Route the decision.</w:t>
+        <w:t xml:space="preserve">Preset "Construction Cost Shock" &gt; Run scenario &gt; Show calculation &gt; open the top option &gt; Save scenario &gt; Route the decision.</w:t>
       </w:r>
     </w:p>
     <w:p>
@@ -1826,7 +1826,7 @@
           <w:sz w:val="21"/>
           <w:szCs w:val="21"/>
         </w:rPr>
-        <w:t xml:space="preserve">Stressed exposure, "Show calculation", then "What can we do about it?" with ranked options.</w:t>
+        <w:t xml:space="preserve">Bottom line, the stakes (today, under stress, if nothing is done), ten driver sliders, stressed exposure vs board appetite, the calculation, then "What can we do about it?" with ranked options.</w:t>
       </w:r>
     </w:p>
     <w:p>
@@ -1857,7 +1857,7 @@
           <w:sz w:val="21"/>
           <w:szCs w:val="21"/>
         </w:rPr>
-        <w:t xml:space="preserve">Now we test it. Cost up, supply chain stretched. Here is the exposure, and exactly how it is calculated. Below are the options, ranked by return on effort. For each one: how much it reduces, how feasible it is, the cost, and the knock-on effect. For example, re-aligning the supply chain can delay project handovers. The cost of doing nothing is shown too.</w:t>
+        <w:t xml:space="preserve">This is scenario analysis. The bottom line is at the top: what a severe shock does to our exposure, and what waiting costs us. Below, leaders build their own scenario from ten business drivers, such as interest rates, off-plan demand, construction cost and occupancy.</w:t>
       </w:r>
     </w:p>
     <w:p>
@@ -1888,73 +1888,7 @@
           <w:sz w:val="21"/>
           <w:szCs w:val="21"/>
         </w:rPr>
-        <w:t xml:space="preserve">The decision goes into an approval workflow. Every step is logged.</w:t>
-      </w:r>
-    </w:p>
-    <w:p>
-      <w:pPr>
-        <w:spacing w:after="80" w:before="200"/>
-      </w:pPr>
-      <w:r>
-        <w:rPr>
-          <w:rFonts w:ascii="Calibri" w:cs="Calibri" w:eastAsia="Calibri" w:hAnsi="Calibri"/>
-          <w:b/>
-          <w:bCs/>
-          <w:color w:val="1F2937"/>
-          <w:sz w:val="23"/>
-          <w:szCs w:val="23"/>
-        </w:rPr>
-        <w:t xml:space="preserve">6. Briefing and register link  (1 min)</w:t>
-      </w:r>
-    </w:p>
-    <w:p>
-      <w:pPr>
-        <w:spacing w:after="40"/>
-      </w:pPr>
-      <w:r>
-        <w:rPr>
-          <w:rFonts w:ascii="Calibri" w:cs="Calibri" w:eastAsia="Calibri" w:hAnsi="Calibri"/>
-          <w:b/>
-          <w:bCs/>
-          <w:sz w:val="21"/>
-          <w:szCs w:val="21"/>
-        </w:rPr>
-        <w:t xml:space="preserve">Screen: </w:t>
-      </w:r>
-      <w:r>
-        <w:rPr>
-          <w:rFonts w:ascii="Calibri" w:cs="Calibri" w:eastAsia="Calibri" w:hAnsi="Calibri"/>
-          <w:b w:val="false"/>
-          <w:bCs w:val="false"/>
-          <w:sz w:val="21"/>
-          <w:szCs w:val="21"/>
-        </w:rPr>
-        <w:t xml:space="preserve">External triggers, AI Fusion Layer; then Executive Brief</w:t>
-      </w:r>
-    </w:p>
-    <w:p>
-      <w:pPr>
-        <w:spacing w:after="40"/>
-      </w:pPr>
-      <w:r>
-        <w:rPr>
-          <w:rFonts w:ascii="Calibri" w:cs="Calibri" w:eastAsia="Calibri" w:hAnsi="Calibri"/>
-          <w:b/>
-          <w:bCs/>
-          <w:sz w:val="21"/>
-          <w:szCs w:val="21"/>
-        </w:rPr>
-        <w:t xml:space="preserve">Click: </w:t>
-      </w:r>
-      <w:r>
-        <w:rPr>
-          <w:rFonts w:ascii="Calibri" w:cs="Calibri" w:eastAsia="Calibri" w:hAnsi="Calibri"/>
-          <w:b w:val="false"/>
-          <w:bCs w:val="false"/>
-          <w:sz w:val="21"/>
-          <w:szCs w:val="21"/>
-        </w:rPr>
-        <w:t xml:space="preserve">Generate Executive Brief.</w:t>
+        <w:t xml:space="preserve">Let us test our hero risk. Construction cost up, supply chain stretched. Run. Here is the stressed exposure against board appetite, and the calculation line by line. Nothing is hidden. The sensitivities are illustrative until we calibrate them on your books.</w:t>
       </w:r>
     </w:p>
     <w:p>
@@ -1985,73 +1919,7 @@
           <w:sz w:val="21"/>
           <w:szCs w:val="21"/>
         </w:rPr>
-        <w:t xml:space="preserve">This is the key point. We do not replace your risk register, we enrich it. Each outside signal is mapped onto your existing risks, showing whether it makes them worse or better. And on demand, the tool produces a board-ready brief for the risk committee.</w:t>
-      </w:r>
-    </w:p>
-    <w:p>
-      <w:pPr>
-        <w:spacing w:after="100"/>
-      </w:pPr>
-      <w:r>
-        <w:rPr>
-          <w:rFonts w:ascii="Calibri" w:cs="Calibri" w:eastAsia="Calibri" w:hAnsi="Calibri"/>
-          <w:b/>
-          <w:bCs/>
-          <w:sz w:val="21"/>
-          <w:szCs w:val="21"/>
-        </w:rPr>
-        <w:t xml:space="preserve">Who uses it: </w:t>
-      </w:r>
-      <w:r>
-        <w:rPr>
-          <w:rFonts w:ascii="Calibri" w:cs="Calibri" w:eastAsia="Calibri" w:hAnsi="Calibri"/>
-          <w:b w:val="false"/>
-          <w:bCs w:val="false"/>
-          <w:sz w:val="21"/>
-          <w:szCs w:val="21"/>
-        </w:rPr>
-        <w:t xml:space="preserve">Risk champions keep their risks current. Risk managers challenge and track. Executives decide. The board risk committee gets the brief.</w:t>
-      </w:r>
-    </w:p>
-    <w:p>
-      <w:pPr>
-        <w:spacing w:after="80" w:before="200"/>
-      </w:pPr>
-      <w:r>
-        <w:rPr>
-          <w:rFonts w:ascii="Calibri" w:cs="Calibri" w:eastAsia="Calibri" w:hAnsi="Calibri"/>
-          <w:b/>
-          <w:bCs/>
-          <w:color w:val="1F2937"/>
-          <w:sz w:val="23"/>
-          <w:szCs w:val="23"/>
-        </w:rPr>
-        <w:t xml:space="preserve">7. Close  (0.5 min)</w:t>
-      </w:r>
-    </w:p>
-    <w:p>
-      <w:pPr>
-        <w:spacing w:after="40"/>
-      </w:pPr>
-      <w:r>
-        <w:rPr>
-          <w:rFonts w:ascii="Calibri" w:cs="Calibri" w:eastAsia="Calibri" w:hAnsi="Calibri"/>
-          <w:b/>
-          <w:bCs/>
-          <w:sz w:val="21"/>
-          <w:szCs w:val="21"/>
-        </w:rPr>
-        <w:t xml:space="preserve">Screen: </w:t>
-      </w:r>
-      <w:r>
-        <w:rPr>
-          <w:rFonts w:ascii="Calibri" w:cs="Calibri" w:eastAsia="Calibri" w:hAnsi="Calibri"/>
-          <w:b w:val="false"/>
-          <w:bCs w:val="false"/>
-          <w:sz w:val="21"/>
-          <w:szCs w:val="21"/>
-        </w:rPr>
-        <w:t xml:space="preserve">Back to Posture</w:t>
+        <w:t xml:space="preserve">Now the important part: what can we do about it. The options are ranked by return on effort. For each one you see how much it reduces, how feasible it is, the cost, and the knock-on effect elsewhere. For example, re-aligning the supply chain can delay project handovers. These come from a fixed, reviewable library, not made up by AI.</w:t>
       </w:r>
     </w:p>
     <w:p>
@@ -2082,11 +1950,206 @@
           <w:sz w:val="21"/>
           <w:szCs w:val="21"/>
         </w:rPr>
+        <w:t xml:space="preserve">We save the scenario for the next committee, and route the decision into the approval workflow. Every step is logged.</w:t>
+      </w:r>
+    </w:p>
+    <w:p>
+      <w:pPr>
+        <w:spacing w:after="80" w:before="200"/>
+      </w:pPr>
+      <w:r>
+        <w:rPr>
+          <w:rFonts w:ascii="Calibri" w:cs="Calibri" w:eastAsia="Calibri" w:hAnsi="Calibri"/>
+          <w:b/>
+          <w:bCs/>
+          <w:color w:val="1F2937"/>
+          <w:sz w:val="23"/>
+          <w:szCs w:val="23"/>
+        </w:rPr>
+        <w:t xml:space="preserve">6. Briefing and register link  (1 min)</w:t>
+      </w:r>
+    </w:p>
+    <w:p>
+      <w:pPr>
+        <w:spacing w:after="40"/>
+      </w:pPr>
+      <w:r>
+        <w:rPr>
+          <w:rFonts w:ascii="Calibri" w:cs="Calibri" w:eastAsia="Calibri" w:hAnsi="Calibri"/>
+          <w:b/>
+          <w:bCs/>
+          <w:sz w:val="21"/>
+          <w:szCs w:val="21"/>
+        </w:rPr>
+        <w:t xml:space="preserve">Screen: </w:t>
+      </w:r>
+      <w:r>
+        <w:rPr>
+          <w:rFonts w:ascii="Calibri" w:cs="Calibri" w:eastAsia="Calibri" w:hAnsi="Calibri"/>
+          <w:b w:val="false"/>
+          <w:bCs w:val="false"/>
+          <w:sz w:val="21"/>
+          <w:szCs w:val="21"/>
+        </w:rPr>
+        <w:t xml:space="preserve">External triggers, AI Fusion Layer; then Executive Brief</w:t>
+      </w:r>
+    </w:p>
+    <w:p>
+      <w:pPr>
+        <w:spacing w:after="40"/>
+      </w:pPr>
+      <w:r>
+        <w:rPr>
+          <w:rFonts w:ascii="Calibri" w:cs="Calibri" w:eastAsia="Calibri" w:hAnsi="Calibri"/>
+          <w:b/>
+          <w:bCs/>
+          <w:sz w:val="21"/>
+          <w:szCs w:val="21"/>
+        </w:rPr>
+        <w:t xml:space="preserve">Click: </w:t>
+      </w:r>
+      <w:r>
+        <w:rPr>
+          <w:rFonts w:ascii="Calibri" w:cs="Calibri" w:eastAsia="Calibri" w:hAnsi="Calibri"/>
+          <w:b w:val="false"/>
+          <w:bCs w:val="false"/>
+          <w:sz w:val="21"/>
+          <w:szCs w:val="21"/>
+        </w:rPr>
+        <w:t xml:space="preserve">Generate Executive Brief.</w:t>
+      </w:r>
+    </w:p>
+    <w:p>
+      <w:pPr>
+        <w:pBdr>
+          <w:left w:val="single" w:color="0B6E5B" w:sz="18" w:space="8"/>
+        </w:pBdr>
+        <w:shd w:fill="E8F3F0" w:color="auto" w:val="clear"/>
+        <w:spacing w:after="120" w:before="60"/>
+        <w:ind w:left="360"/>
+      </w:pPr>
+      <w:r>
+        <w:rPr>
+          <w:rFonts w:ascii="Calibri" w:cs="Calibri" w:eastAsia="Calibri" w:hAnsi="Calibri"/>
+          <w:b/>
+          <w:bCs/>
+          <w:color w:val="0B6E5B"/>
+          <w:sz w:val="21"/>
+          <w:szCs w:val="21"/>
+        </w:rPr>
+        <w:t xml:space="preserve">Say: </w:t>
+      </w:r>
+      <w:r>
+        <w:rPr>
+          <w:rFonts w:ascii="Calibri" w:cs="Calibri" w:eastAsia="Calibri" w:hAnsi="Calibri"/>
+          <w:i/>
+          <w:iCs/>
+          <w:sz w:val="21"/>
+          <w:szCs w:val="21"/>
+        </w:rPr>
+        <w:t xml:space="preserve">This is the key point. We do not replace your risk register, we enrich it. Each outside signal is mapped onto your existing risks, showing whether it makes them worse or better. And on demand, the tool produces a board-ready brief for the risk committee.</w:t>
+      </w:r>
+    </w:p>
+    <w:p>
+      <w:pPr>
+        <w:spacing w:after="100"/>
+      </w:pPr>
+      <w:r>
+        <w:rPr>
+          <w:rFonts w:ascii="Calibri" w:cs="Calibri" w:eastAsia="Calibri" w:hAnsi="Calibri"/>
+          <w:b/>
+          <w:bCs/>
+          <w:sz w:val="21"/>
+          <w:szCs w:val="21"/>
+        </w:rPr>
+        <w:t xml:space="preserve">Who uses it: </w:t>
+      </w:r>
+      <w:r>
+        <w:rPr>
+          <w:rFonts w:ascii="Calibri" w:cs="Calibri" w:eastAsia="Calibri" w:hAnsi="Calibri"/>
+          <w:b w:val="false"/>
+          <w:bCs w:val="false"/>
+          <w:sz w:val="21"/>
+          <w:szCs w:val="21"/>
+        </w:rPr>
+        <w:t xml:space="preserve">Risk champions keep their risks current. Risk managers challenge and track. Executives decide. The board risk committee gets the brief.</w:t>
+      </w:r>
+    </w:p>
+    <w:p>
+      <w:pPr>
+        <w:spacing w:after="80" w:before="200"/>
+      </w:pPr>
+      <w:r>
+        <w:rPr>
+          <w:rFonts w:ascii="Calibri" w:cs="Calibri" w:eastAsia="Calibri" w:hAnsi="Calibri"/>
+          <w:b/>
+          <w:bCs/>
+          <w:color w:val="1F2937"/>
+          <w:sz w:val="23"/>
+          <w:szCs w:val="23"/>
+        </w:rPr>
+        <w:t xml:space="preserve">7. Close  (0.5 min)</w:t>
+      </w:r>
+    </w:p>
+    <w:p>
+      <w:pPr>
+        <w:spacing w:after="40"/>
+      </w:pPr>
+      <w:r>
+        <w:rPr>
+          <w:rFonts w:ascii="Calibri" w:cs="Calibri" w:eastAsia="Calibri" w:hAnsi="Calibri"/>
+          <w:b/>
+          <w:bCs/>
+          <w:sz w:val="21"/>
+          <w:szCs w:val="21"/>
+        </w:rPr>
+        <w:t xml:space="preserve">Screen: </w:t>
+      </w:r>
+      <w:r>
+        <w:rPr>
+          <w:rFonts w:ascii="Calibri" w:cs="Calibri" w:eastAsia="Calibri" w:hAnsi="Calibri"/>
+          <w:b w:val="false"/>
+          <w:bCs w:val="false"/>
+          <w:sz w:val="21"/>
+          <w:szCs w:val="21"/>
+        </w:rPr>
+        <w:t xml:space="preserve">Back to Posture</w:t>
+      </w:r>
+    </w:p>
+    <w:p>
+      <w:pPr>
+        <w:pBdr>
+          <w:left w:val="single" w:color="0B6E5B" w:sz="18" w:space="8"/>
+        </w:pBdr>
+        <w:shd w:fill="E8F3F0" w:color="auto" w:val="clear"/>
+        <w:spacing w:after="120" w:before="60"/>
+        <w:ind w:left="360"/>
+      </w:pPr>
+      <w:r>
+        <w:rPr>
+          <w:rFonts w:ascii="Calibri" w:cs="Calibri" w:eastAsia="Calibri" w:hAnsi="Calibri"/>
+          <w:b/>
+          <w:bCs/>
+          <w:color w:val="0B6E5B"/>
+          <w:sz w:val="21"/>
+          <w:szCs w:val="21"/>
+        </w:rPr>
+        <w:t xml:space="preserve">Say: </w:t>
+      </w:r>
+      <w:r>
+        <w:rPr>
+          <w:rFonts w:ascii="Calibri" w:cs="Calibri" w:eastAsia="Calibri" w:hAnsi="Calibri"/>
+          <w:i/>
+          <w:iCs/>
+          <w:sz w:val="21"/>
+          <w:szCs w:val="21"/>
+        </w:rPr>
         <w:t xml:space="preserve">In one line: outside risk, read in your business context, so you act before the issue lands, not after. As a next step we suggest a short pilot on your real portfolio, so every number on screen is yours.</w:t>
       </w:r>
     </w:p>
     <w:p>
       <w:pPr>
+        <w:pageBreakBefore/>
         <w:pBdr>
           <w:bottom w:val="single" w:color="0B6E5B" w:sz="6" w:space="2"/>
         </w:pBdr>

</xml_diff>